<commit_message>
publish student projects (Fall 2026) 2026-09-22 21:27
</commit_message>
<xml_diff>
--- a/Social-Media/neighbour-link.docx
+++ b/Social-Media/neighbour-link.docx
@@ -2393,7 +2393,7 @@
         <w:t xml:space="preserve"> </w:t>
       </w:r>
       <w:r>
-        <w:t xml:space="preserve">6 CS + 1 Design + 1 Art (8) — the four design features (feed, event creation, interest matching, reputation &amp; reward) are a strong single-designer load, and the art surface (feed cards, hobby/interest iconography, reputation badges &amp; reward tiers, event/geofence imagery) is a utility social-app surface one artist can cover (rules: min 1 Design mandated, max 9 total, D+A ≤ 3; see</w:t>
+        <w:t xml:space="preserve">6 CS + 1 Design + 0 Art (7) — the four design features (feed, event creation, interest matching, reputation &amp; reward) are a strong single-designer load (rules: min 1 Design mandated, max 9 total, D+A ≤ 3; see</w:t>
       </w:r>
       <w:r>
         <w:t xml:space="preserve"> </w:t>
@@ -2405,7 +2405,52 @@
         <w:t xml:space="preserve">team-formation.pdf</w:t>
       </w:r>
       <w:r>
-        <w:t xml:space="preserve">). Add a 2nd artist only if a richer illustrated hobby/badge set becomes a selling point.</w:t>
+        <w:t xml:space="preserve">).</w:t>
+      </w:r>
+      <w:r>
+        <w:t xml:space="preserve"> </w:t>
+      </w:r>
+      <w:r>
+        <w:rPr>
+          <w:b/>
+        </w:rPr>
+        <w:t xml:space="preserve">Art-risk flag:</w:t>
+      </w:r>
+      <w:r>
+        <w:t xml:space="preserve"> </w:t>
+      </w:r>
+      <w:r>
+        <w:t xml:space="preserve">the art surface (feed cards, hobby/interest iconography, reputation badges &amp; reward tiers, event/geofence imagery) is a real utility social-app surface, so with</w:t>
+      </w:r>
+      <w:r>
+        <w:t xml:space="preserve"> </w:t>
+      </w:r>
+      <w:r>
+        <w:rPr>
+          <w:b/>
+        </w:rPr>
+        <w:t xml:space="preserve">0 artists</w:t>
+      </w:r>
+      <w:r>
+        <w:t xml:space="preserve"> </w:t>
+      </w:r>
+      <w:r>
+        <w:t xml:space="preserve">it is owned by the designer through the</w:t>
+      </w:r>
+      <w:r>
+        <w:t xml:space="preserve"> </w:t>
+      </w:r>
+      <w:r>
+        <w:rPr>
+          <w:b/>
+        </w:rPr>
+        <w:t xml:space="preserve">D11 conditional</w:t>
+      </w:r>
+      <w:r>
+        <w:t xml:space="preserve"> </w:t>
+      </w:r>
+      <w:r>
+        <w:t xml:space="preserve">(Art Proof of Concept M1 / Art Implementation Quality M2, the last Design goal each milestone). No hand-modelled assets here, but a coherent icon/badge system still needs real visual-design effort — scope it hard under D11 (a tight icon set + a clean card/badge language), or add an artist within D+A ≤ 3 if a richer illustrated hobby/badge set becomes a selling point.</w:t>
       </w:r>
     </w:p>
     <w:p>
@@ -2467,6 +2512,18 @@
     <w:p>
       <w:pPr>
         <w:numPr>
+          <w:ilvl w:val="1"/>
+          <w:numId w:val="1019"/>
+        </w:numPr>
+        <w:pStyle w:val="Compact"/>
+      </w:pPr>
+      <w:r>
+        <w:t xml:space="preserve">M1D11 Art Proof of Concept (conditional — 0-artist team, Design-owned): the social-app visual direction — feed cards, hobby/interest icon set, reputation/reward badge language, event/geofence imagery; 2 mockup screens</w:t>
+      </w:r>
+    </w:p>
+    <w:p>
+      <w:pPr>
+        <w:numPr>
           <w:ilvl w:val="0"/>
           <w:numId w:val="1018"/>
         </w:numPr>
@@ -2500,7 +2557,7 @@
         <w:pStyle w:val="Compact"/>
       </w:pPr>
       <w:r>
-        <w:t xml:space="preserve">M2D3 Systems Balance &amp; Tuning — Data-Driven (matching weights and reward tiers tuned via the team's JSON, no code changes)</w:t>
+        <w:t xml:space="preserve">M2D11 Art Implementation Quality (conditional — 0-artist team, Design-owned): all in-app art implemented in-engine, no placeholders — feed cards, the full hobby/interest icon set, reputation/reward-tier badges, event/geofence imagery and empty/onboarding states</w:t>
       </w:r>
     </w:p>
     <w:p>
@@ -2599,49 +2656,67 @@
         <w:rPr>
           <w:b/>
         </w:rPr>
-        <w:t xml:space="preserve">Art M1:</w:t>
-      </w:r>
-      <w:r>
-        <w:t xml:space="preserve"> </w:t>
-      </w:r>
-      <w:r>
-        <w:t xml:space="preserve">1 artist (utility social-app surface)</w:t>
-      </w:r>
-    </w:p>
-    <w:p>
-      <w:pPr>
-        <w:numPr>
-          <w:ilvl w:val="1"/>
-          <w:numId w:val="1023"/>
-        </w:numPr>
-        <w:pStyle w:val="Compact"/>
-      </w:pPr>
-      <w:r>
-        <w:t xml:space="preserve">M1A1 ⭐ (mockups: hobbies-discovery feed + event-creation screen)</w:t>
-      </w:r>
-    </w:p>
-    <w:p>
-      <w:pPr>
-        <w:numPr>
-          <w:ilvl w:val="1"/>
-          <w:numId w:val="1023"/>
-        </w:numPr>
-        <w:pStyle w:val="Compact"/>
-      </w:pPr>
-      <w:r>
-        <w:t xml:space="preserve">M1A4 UI Art Concepts &amp; Typography (feed cards, hobby/interest icon set, reputation/reward visual language)</w:t>
-      </w:r>
-    </w:p>
-    <w:p>
-      <w:pPr>
-        <w:numPr>
-          <w:ilvl w:val="1"/>
-          <w:numId w:val="1023"/>
-        </w:numPr>
-        <w:pStyle w:val="Compact"/>
-      </w:pPr>
-      <w:r>
-        <w:t xml:space="preserve">M1A6 Early Asset Production (first production-ready icon &amp; badge set)</w:t>
+        <w:t xml:space="preserve">Art:</w:t>
+      </w:r>
+      <w:r>
+        <w:t xml:space="preserve"> </w:t>
+      </w:r>
+      <w:r>
+        <w:rPr>
+          <w:i/>
+        </w:rPr>
+        <w:t xml:space="preserve">no artist on this team (0 Art).</w:t>
+      </w:r>
+      <w:r>
+        <w:t xml:space="preserve"> </w:t>
+      </w:r>
+      <w:r>
+        <w:t xml:space="preserve">The utility social-app surface (feed cards, hobby/interest iconography, reputation/reward-tier badges and event/geofence imagery) is owned by the designer through the</w:t>
+      </w:r>
+      <w:r>
+        <w:t xml:space="preserve"> </w:t>
+      </w:r>
+      <w:r>
+        <w:rPr>
+          <w:b/>
+        </w:rPr>
+        <w:t xml:space="preserve">D11 conditional</w:t>
+      </w:r>
+      <w:r>
+        <w:t xml:space="preserve"> </w:t>
+      </w:r>
+      <w:r>
+        <w:t xml:space="preserve">—</w:t>
+      </w:r>
+      <w:r>
+        <w:t xml:space="preserve"> </w:t>
+      </w:r>
+      <w:r>
+        <w:rPr>
+          <w:b/>
+        </w:rPr>
+        <w:t xml:space="preserve">M1D11 Art Proof of Concept</w:t>
+      </w:r>
+      <w:r>
+        <w:t xml:space="preserve"> </w:t>
+      </w:r>
+      <w:r>
+        <w:t xml:space="preserve">(visual direction + 2 mockups) and</w:t>
+      </w:r>
+      <w:r>
+        <w:t xml:space="preserve"> </w:t>
+      </w:r>
+      <w:r>
+        <w:rPr>
+          <w:b/>
+        </w:rPr>
+        <w:t xml:space="preserve">M2D11 Art Implementation Quality</w:t>
+      </w:r>
+      <w:r>
+        <w:t xml:space="preserve"> </w:t>
+      </w:r>
+      <w:r>
+        <w:t xml:space="preserve">(all art in-engine, no placeholders, incl. empty/onboarding states), shown above as the last Design goal each milestone. No hand-modelled assets, but a coherent icon/badge system still needs real visual-design effort. Scope art hard, or add an artist within D+A ≤ 3.</w:t>
       </w:r>
     </w:p>
     <w:p>
@@ -2656,43 +2731,31 @@
         <w:rPr>
           <w:b/>
         </w:rPr>
-        <w:t xml:space="preserve">Art M2:</w:t>
-      </w:r>
-    </w:p>
-    <w:p>
-      <w:pPr>
-        <w:numPr>
-          <w:ilvl w:val="1"/>
-          <w:numId w:val="1024"/>
-        </w:numPr>
-        <w:pStyle w:val="Compact"/>
-      </w:pPr>
-      <w:r>
-        <w:t xml:space="preserve">M2A1 ⭐ (polished feed, event and reputation screens)</w:t>
-      </w:r>
-    </w:p>
-    <w:p>
-      <w:pPr>
-        <w:numPr>
-          <w:ilvl w:val="1"/>
-          <w:numId w:val="1024"/>
-        </w:numPr>
-        <w:pStyle w:val="Compact"/>
-      </w:pPr>
-      <w:r>
-        <w:t xml:space="preserve">M2A4 UI Art — States &amp; Feedback (match found, event full, reputation up/down, reward unlocked)</w:t>
-      </w:r>
-    </w:p>
-    <w:p>
-      <w:pPr>
-        <w:numPr>
-          <w:ilvl w:val="1"/>
-          <w:numId w:val="1024"/>
-        </w:numPr>
-        <w:pStyle w:val="Compact"/>
-      </w:pPr>
-      <w:r>
-        <w:t xml:space="preserve">M2A5 Illustration &amp; Iconography — Full Set (complete hobby/interest icons, reward-tier badges, empty/onboarding states)</w:t>
+        <w:t xml:space="preserve">TEAM M1:</w:t>
+      </w:r>
+    </w:p>
+    <w:p>
+      <w:pPr>
+        <w:numPr>
+          <w:ilvl w:val="1"/>
+          <w:numId w:val="1023"/>
+        </w:numPr>
+        <w:pStyle w:val="Compact"/>
+      </w:pPr>
+      <w:r>
+        <w:t xml:space="preserve">M1TA1 ⭐ Overall Audio Experience — initial UI/alert SFX and light ambient BGM from the week-5 needs list, present &amp; working in the prototype (match found, event invite, reputation change), suitable and correctly triggered.</w:t>
+      </w:r>
+    </w:p>
+    <w:p>
+      <w:pPr>
+        <w:numPr>
+          <w:ilvl w:val="1"/>
+          <w:numId w:val="1023"/>
+        </w:numPr>
+        <w:pStyle w:val="Compact"/>
+      </w:pPr>
+      <w:r>
+        <w:t xml:space="preserve">M1TA2 ⭐ Audio Engine Functionality — data-driven audio pipeline (add/replace files without recompiling) + reliable multi-channel playback (overlapping alert/UI SFX).</w:t>
       </w:r>
     </w:p>
     <w:p>
@@ -2707,45 +2770,6 @@
         <w:rPr>
           <w:b/>
         </w:rPr>
-        <w:t xml:space="preserve">TEAM M1:</w:t>
-      </w:r>
-    </w:p>
-    <w:p>
-      <w:pPr>
-        <w:numPr>
-          <w:ilvl w:val="1"/>
-          <w:numId w:val="1025"/>
-        </w:numPr>
-        <w:pStyle w:val="Compact"/>
-      </w:pPr>
-      <w:r>
-        <w:t xml:space="preserve">M1TA1 ⭐ Overall Audio Experience — initial UI/alert SFX and light ambient BGM from the week-5 needs list, present &amp; working in the prototype (match found, event invite, reputation change), suitable and correctly triggered.</w:t>
-      </w:r>
-    </w:p>
-    <w:p>
-      <w:pPr>
-        <w:numPr>
-          <w:ilvl w:val="1"/>
-          <w:numId w:val="1025"/>
-        </w:numPr>
-        <w:pStyle w:val="Compact"/>
-      </w:pPr>
-      <w:r>
-        <w:t xml:space="preserve">M1TA2 ⭐ Audio Engine Functionality — data-driven audio pipeline (add/replace files without recompiling) + reliable multi-channel playback (overlapping alert/UI SFX).</w:t>
-      </w:r>
-    </w:p>
-    <w:p>
-      <w:pPr>
-        <w:numPr>
-          <w:ilvl w:val="0"/>
-          <w:numId w:val="1018"/>
-        </w:numPr>
-        <w:pStyle w:val="Compact"/>
-      </w:pPr>
-      <w:r>
-        <w:rPr>
-          <w:b/>
-        </w:rPr>
         <w:t xml:space="preserve">TEAM M2:</w:t>
       </w:r>
     </w:p>
@@ -2753,7 +2777,7 @@
       <w:pPr>
         <w:numPr>
           <w:ilvl w:val="1"/>
-          <w:numId w:val="1026"/>
+          <w:numId w:val="1024"/>
         </w:numPr>
         <w:pStyle w:val="Compact"/>
       </w:pPr>
@@ -2765,7 +2789,7 @@
       <w:pPr>
         <w:numPr>
           <w:ilvl w:val="1"/>
-          <w:numId w:val="1026"/>
+          <w:numId w:val="1024"/>
         </w:numPr>
         <w:pStyle w:val="Compact"/>
       </w:pPr>
@@ -2777,7 +2801,7 @@
       <w:pPr>
         <w:numPr>
           <w:ilvl w:val="1"/>
-          <w:numId w:val="1026"/>
+          <w:numId w:val="1024"/>
         </w:numPr>
         <w:pStyle w:val="Compact"/>
       </w:pPr>
@@ -3125,12 +3149,6 @@
     <w:abstractNumId w:val="991"/>
   </w:num>
   <w:num w:numId="1024">
-    <w:abstractNumId w:val="991"/>
-  </w:num>
-  <w:num w:numId="1025">
-    <w:abstractNumId w:val="991"/>
-  </w:num>
-  <w:num w:numId="1026">
     <w:abstractNumId w:val="991"/>
   </w:num>
 </w:numbering>

</xml_diff>